<commit_message>
Update resume files and documents
</commit_message>
<xml_diff>
--- a/giri_resume.docx
+++ b/giri_resume.docx
@@ -11,7 +11,7 @@
           <w:noProof/>
         </w:rPr>
         <w:drawing>
-          <wp:anchor distT="0" distB="0" distL="0" distR="0" simplePos="0" relativeHeight="15730176" behindDoc="1" locked="0" layoutInCell="1" allowOverlap="1" wp14:anchorId="53B2BABE" wp14:editId="7F0577CA">
+          <wp:anchor distT="0" distB="0" distL="0" distR="0" simplePos="0" relativeHeight="15730176" behindDoc="1" locked="0" layoutInCell="1" allowOverlap="1" wp14:anchorId="53B2BABE" wp14:editId="503467FE">
             <wp:simplePos x="0" y="0"/>
             <wp:positionH relativeFrom="page">
               <wp:posOffset>5797550</wp:posOffset>
@@ -33,9 +33,15 @@
                     <pic:cNvPr id="1" name="Image 1"/>
                     <pic:cNvPicPr/>
                   </pic:nvPicPr>
-                  <pic:blipFill rotWithShape="1">
-                    <a:blip r:embed="rId5" cstate="print"/>
-                    <a:srcRect l="10585" t="-507" r="14315" b="-1"/>
+                  <pic:blipFill>
+                    <a:blip r:embed="rId6" cstate="print">
+                      <a:extLst>
+                        <a:ext uri="{28A0092B-C50C-407E-A947-70E740481C1C}">
+                          <a14:useLocalDpi xmlns:a14="http://schemas.microsoft.com/office/drawing/2010/main" val="0"/>
+                        </a:ext>
+                      </a:extLst>
+                    </a:blip>
+                    <a:srcRect t="1775" b="1775"/>
                     <a:stretch>
                       <a:fillRect/>
                     </a:stretch>
@@ -129,18 +135,18 @@
         <w:rPr>
           <w:color w:val="0000FF"/>
         </w:rPr>
+        <w:t xml:space="preserve"> </w:t>
+      </w:r>
+      <w:r>
+        <w:rPr>
+          <w:spacing w:val="-10"/>
+        </w:rPr>
+        <w:t>|</w:t>
+      </w:r>
+      <w:r>
         <w:tab/>
       </w:r>
-      <w:r>
-        <w:rPr>
-          <w:spacing w:val="-10"/>
-        </w:rPr>
-        <w:t>|</w:t>
-      </w:r>
-      <w:r>
-        <w:tab/>
-      </w:r>
-      <w:hyperlink r:id="rId6">
+      <w:hyperlink r:id="rId7">
         <w:r>
           <w:rPr>
             <w:color w:val="0000FF"/>
@@ -153,7 +159,7 @@
         <w:rPr>
           <w:color w:val="0000FF"/>
         </w:rPr>
-        <w:tab/>
+        <w:t xml:space="preserve"> </w:t>
       </w:r>
       <w:r>
         <w:rPr>
@@ -162,15 +168,27 @@
         <w:t>|</w:t>
       </w:r>
       <w:r>
-        <w:tab/>
-      </w:r>
-      <w:hyperlink r:id="rId7">
+        <w:t xml:space="preserve"> </w:t>
+      </w:r>
+      <w:hyperlink r:id="rId8">
         <w:r>
           <w:rPr>
             <w:color w:val="0000FF"/>
             <w:spacing w:val="-2"/>
           </w:rPr>
           <w:t>LinkedIn</w:t>
+        </w:r>
+      </w:hyperlink>
+      <w:r>
+        <w:t xml:space="preserve"> | </w:t>
+      </w:r>
+      <w:hyperlink r:id="rId9">
+        <w:r>
+          <w:rPr>
+            <w:color w:val="0000FF"/>
+            <w:spacing w:val="-2"/>
+          </w:rPr>
+          <w:t>Portfolio</w:t>
         </w:r>
       </w:hyperlink>
     </w:p>
@@ -1038,21 +1056,12 @@
         </w:rPr>
         <w:t xml:space="preserve"> </w:t>
       </w:r>
-      <w:proofErr w:type="spellStart"/>
-      <w:r>
-        <w:rPr>
-          <w:spacing w:val="-2"/>
-          <w:sz w:val="20"/>
-        </w:rPr>
-        <w:t>FastAPI</w:t>
-      </w:r>
-      <w:proofErr w:type="spellEnd"/>
-      <w:r>
-        <w:rPr>
-          <w:spacing w:val="-2"/>
-          <w:sz w:val="20"/>
-        </w:rPr>
-        <w:t>,</w:t>
+      <w:r>
+        <w:rPr>
+          <w:spacing w:val="-2"/>
+          <w:sz w:val="20"/>
+        </w:rPr>
+        <w:t>FastAPI,</w:t>
       </w:r>
       <w:r>
         <w:rPr>
@@ -1370,11 +1379,9 @@
         <w:spacing w:line="360" w:lineRule="auto"/>
         <w:jc w:val="both"/>
       </w:pPr>
-      <w:proofErr w:type="spellStart"/>
       <w:r>
         <w:t>StudySync</w:t>
       </w:r>
-      <w:proofErr w:type="spellEnd"/>
       <w:r>
         <w:rPr>
           <w:spacing w:val="13"/>
@@ -1390,7 +1397,7 @@
       <w:r>
         <w:tab/>
       </w:r>
-      <w:hyperlink r:id="rId8">
+      <w:hyperlink r:id="rId10">
         <w:r>
           <w:rPr>
             <w:color w:val="0000FF"/>
@@ -1906,13 +1913,8 @@
         </w:tabs>
         <w:spacing w:before="112" w:line="360" w:lineRule="auto"/>
       </w:pPr>
-      <w:proofErr w:type="spellStart"/>
-      <w:r>
-        <w:t>TripMate</w:t>
-      </w:r>
-      <w:proofErr w:type="spellEnd"/>
-      <w:r>
-        <w:t>:</w:t>
+      <w:r>
+        <w:t>TripMate:</w:t>
       </w:r>
       <w:r>
         <w:rPr>
@@ -1941,7 +1943,7 @@
       <w:r>
         <w:tab/>
       </w:r>
-      <w:hyperlink r:id="rId9">
+      <w:hyperlink r:id="rId11">
         <w:r>
           <w:rPr>
             <w:color w:val="0000FF"/>
@@ -2421,21 +2423,12 @@
         </w:rPr>
         <w:t xml:space="preserve"> </w:t>
       </w:r>
-      <w:proofErr w:type="spellStart"/>
       <w:r>
         <w:rPr>
           <w:i/>
           <w:sz w:val="20"/>
         </w:rPr>
-        <w:t>FastAPI</w:t>
-      </w:r>
-      <w:proofErr w:type="spellEnd"/>
-      <w:r>
-        <w:rPr>
-          <w:i/>
-          <w:sz w:val="20"/>
-        </w:rPr>
-        <w:t>,</w:t>
+        <w:t>FastAPI,</w:t>
       </w:r>
       <w:r>
         <w:rPr>
@@ -2778,19 +2771,11 @@
         </w:rPr>
         <w:t xml:space="preserve"> </w:t>
       </w:r>
-      <w:proofErr w:type="spellStart"/>
-      <w:r>
-        <w:rPr>
-          <w:sz w:val="20"/>
-        </w:rPr>
-        <w:t>FastAPI</w:t>
-      </w:r>
-      <w:proofErr w:type="spellEnd"/>
-      <w:r>
-        <w:rPr>
-          <w:sz w:val="20"/>
-        </w:rPr>
-        <w:t>,</w:t>
+      <w:r>
+        <w:rPr>
+          <w:sz w:val="20"/>
+        </w:rPr>
+        <w:t>FastAPI,</w:t>
       </w:r>
       <w:r>
         <w:rPr>
@@ -3335,7 +3320,6 @@
         </w:rPr>
         <w:t>(PUC)</w:t>
       </w:r>
-      <w:proofErr w:type="gramStart"/>
       <w:r>
         <w:tab/>
       </w:r>
@@ -3347,15 +3331,7 @@
           <w:rFonts w:asciiTheme="majorHAnsi" w:hAnsiTheme="majorHAnsi" w:cs="Times New Roman"/>
           <w:spacing w:val="-2"/>
         </w:rPr>
-        <w:t>Percentage</w:t>
-      </w:r>
-      <w:proofErr w:type="gramEnd"/>
-      <w:r>
-        <w:rPr>
-          <w:rFonts w:asciiTheme="majorHAnsi" w:hAnsiTheme="majorHAnsi" w:cs="Times New Roman"/>
-          <w:spacing w:val="-2"/>
-        </w:rPr>
-        <w:t>:</w:t>
+        <w:t>Percentage:</w:t>
       </w:r>
       <w:r>
         <w:rPr>
@@ -3571,13 +3547,8 @@
         <w:ind w:left="0"/>
       </w:pPr>
       <w:r>
-        <w:t xml:space="preserve">  </w:t>
-      </w:r>
-      <w:proofErr w:type="spellStart"/>
-      <w:r>
-        <w:t>Dhee</w:t>
-      </w:r>
-      <w:proofErr w:type="spellEnd"/>
+        <w:t xml:space="preserve">  Dhee</w:t>
+      </w:r>
       <w:r>
         <w:rPr>
           <w:spacing w:val="7"/>
@@ -4575,4 +4546,16 @@
   <a:objectDefaults/>
   <a:extraClrSchemeLst/>
 </a:theme>
+</file>
+
+<file path=customXml/item1.xml><?xml version="1.0" encoding="utf-8"?>
+<b:Sources xmlns:b="http://schemas.openxmlformats.org/officeDocument/2006/bibliography" xmlns="http://schemas.openxmlformats.org/officeDocument/2006/bibliography" SelectedStyle="\APASixthEditionOfficeOnline.xsl" StyleName="APA" Version="6"/>
+</file>
+
+<file path=customXml/itemProps1.xml><?xml version="1.0" encoding="utf-8"?>
+<ds:datastoreItem xmlns:ds="http://schemas.openxmlformats.org/officeDocument/2006/customXml" ds:itemID="{5D555F63-54F9-48D3-ADFD-1451CF365CF4}">
+  <ds:schemaRefs>
+    <ds:schemaRef ds:uri="http://schemas.openxmlformats.org/officeDocument/2006/bibliography"/>
+  </ds:schemaRefs>
+</ds:datastoreItem>
 </file>
</xml_diff>